<commit_message>
Update all DOCX/PDF documents in repo
</commit_message>
<xml_diff>
--- a/2026-03-06 The New Loop A Future History of the AI Transition.docx
+++ b/2026-03-06 The New Loop A Future History of the AI Transition.docx
@@ -62,7 +62,41 @@
     </w:p>
     <w:p>
       <w:r>
-        <w:t xml:space="preserve">The framework brings together policies including a Social Wealth Trust, Universal Basic Income, value-added taxation with rebate, distribution-sensitive income taxation, automation-responsive corporate taxation, and mortgage-adaptation mechanisms. A companion paper presents the quantitative simulation model directly, together with illustrative output graphs, while a public Streamlit implementation will allow readers to inspect assumptions, adjust parameters, and test outcomes for themselves. </w:t>
+        <w:t>The framework brings together policies including a Social Wealth Trust, Universal Basic Income, value-added taxation with rebate, distribution-sensitive income taxation, automation-responsive corporate taxation, and mortgage-adaptation mechanisms. A companion paper</w:t>
+      </w:r>
+      <w:r>
+        <w:t xml:space="preserve">, </w:t>
+      </w:r>
+      <w:r>
+        <w:rPr>
+          <w:i/>
+          <w:iCs/>
+        </w:rPr>
+        <w:t>New Loop Policy Architecture</w:t>
+      </w:r>
+      <w:r>
+        <w:rPr>
+          <w:i/>
+          <w:iCs/>
+        </w:rPr>
+        <w:t xml:space="preserve"> and </w:t>
+      </w:r>
+      <w:r>
+        <w:rPr>
+          <w:i/>
+          <w:iCs/>
+        </w:rPr>
+        <w:t>Simulator</w:t>
+      </w:r>
+      <w:r>
+        <w:rPr>
+          <w:i/>
+          <w:iCs/>
+        </w:rPr>
+        <w:t>,</w:t>
+      </w:r>
+      <w:r>
+        <w:t xml:space="preserve"> presents the quantitative simulation model directly, together with illustrative output graphs, while a public Streamlit implementation will allow readers to inspect assumptions, adjust parameters, and test outcomes for themselves. </w:t>
       </w:r>
     </w:p>
     <w:p>
@@ -359,7 +393,42 @@
     </w:p>
     <w:p>
       <w:r>
-        <w:t>The companion paper presents the quantitative simulation model. It describes a stock-flow-consistent representation of 20,000 households whose wealth, income, revolving debt, and mortgages roughly correspond to distributions observed among families in the United States. It also includes firms, banks, and government as aggregate actors. In that model economy, automation gradually increases the substitution of capital and software for labor. Over time, value added shifts from wages toward profits.</w:t>
+        <w:t>The companion paper</w:t>
+      </w:r>
+      <w:r>
+        <w:t xml:space="preserve"> </w:t>
+      </w:r>
+      <w:r>
+        <w:rPr>
+          <w:i/>
+          <w:iCs/>
+        </w:rPr>
+        <w:t xml:space="preserve">New Loop </w:t>
+      </w:r>
+      <w:r>
+        <w:rPr>
+          <w:i/>
+          <w:iCs/>
+        </w:rPr>
+        <w:t xml:space="preserve">Policy Architecture and </w:t>
+      </w:r>
+      <w:r>
+        <w:rPr>
+          <w:i/>
+          <w:iCs/>
+        </w:rPr>
+        <w:t>Simulator</w:t>
+      </w:r>
+      <w:r>
+        <w:t xml:space="preserve"> </w:t>
+      </w:r>
+      <w:proofErr w:type="gramStart"/>
+      <w:r>
+        <w:t>presents</w:t>
+      </w:r>
+      <w:proofErr w:type="gramEnd"/>
+      <w:r>
+        <w:t xml:space="preserve"> the quantitative simulation model. It describes a stock-flow-consistent representation of 20,000 households whose wealth, income, revolving debt, and mortgages roughly correspond to distributions observed among families in the United States. It also includes firms, banks, and government as aggregate actors. In that model economy, automation gradually increases the substitution of capital and software for labor. Over time, value added shifts from wages toward profits.</w:t>
       </w:r>
     </w:p>
     <w:p>

</xml_diff>